<commit_message>
add html/css files for Task6 and update report
</commit_message>
<xml_diff>
--- a/IGI/LR1/LR1 (IGI).docx
+++ b/IGI/LR1/LR1 (IGI).docx
@@ -6266,13 +6266,112 @@
     <w:p>
       <w:pPr>
         <w:spacing w:after="0"/>
-        <w:jc w:val="both"/>
-      </w:pPr>
-    </w:p>
-    <w:p>
-      <w:pPr>
-        <w:spacing w:after="0"/>
-        <w:jc w:val="both"/>
+        <w:ind w:firstLine="709"/>
+        <w:jc w:val="both"/>
+      </w:pPr>
+      <w:r>
+        <w:t>6</w:t>
+      </w:r>
+      <w:r>
+        <w:t>.</w:t>
+      </w:r>
+      <w:r>
+        <w:t> </w:t>
+      </w:r>
+      <w:r>
+        <w:t>С</w:t>
+      </w:r>
+      <w:r>
+        <w:rPr>
+          <w:lang w:val="en-US"/>
+        </w:rPr>
+        <w:t>c</w:t>
+      </w:r>
+      <w:r>
+        <w:t>ылка на</w:t>
+      </w:r>
+      <w:r>
+        <w:t xml:space="preserve"> публичный репозиторий на </w:t>
+      </w:r>
+      <w:r>
+        <w:rPr>
+          <w:lang w:val="en-US"/>
+        </w:rPr>
+        <w:t>github</w:t>
+      </w:r>
+      <w:r>
+        <w:t xml:space="preserve"> со сгенерированными </w:t>
+      </w:r>
+      <w:r>
+        <w:t xml:space="preserve"> в </w:t>
+      </w:r>
+      <w:r>
+        <w:rPr>
+          <w:lang w:val="en-US"/>
+        </w:rPr>
+        <w:t>DeepSeek</w:t>
+      </w:r>
+      <w:r>
+        <w:t xml:space="preserve"> файл </w:t>
+      </w:r>
+      <w:r>
+        <w:rPr>
+          <w:lang w:val="en-US"/>
+        </w:rPr>
+        <w:t>html</w:t>
+      </w:r>
+      <w:r>
+        <w:t xml:space="preserve"> и файл </w:t>
+      </w:r>
+      <w:r>
+        <w:rPr>
+          <w:lang w:val="en-US"/>
+        </w:rPr>
+        <w:t>css</w:t>
+      </w:r>
+      <w:r>
+        <w:t xml:space="preserve"> для сайта визитки компании</w:t>
+      </w:r>
+      <w:r>
+        <w:t xml:space="preserve"> </w:t>
+      </w:r>
+      <w:r>
+        <w:rPr>
+          <w:lang w:val="en-US"/>
+        </w:rPr>
+        <w:t>TechSolutions</w:t>
+      </w:r>
+      <w:r>
+        <w:t xml:space="preserve">: </w:t>
+      </w:r>
+      <w:hyperlink r:id="rId50" w:history="1">
+        <w:r>
+          <w:rPr>
+            <w:rStyle w:val="Hyperlink"/>
+          </w:rPr>
+          <w:t>https://vkwalker31.github.io/</w:t>
+        </w:r>
+      </w:hyperlink>
+      <w:r>
+        <w:t>.</w:t>
+      </w:r>
+    </w:p>
+    <w:p>
+      <w:pPr>
+        <w:spacing w:after="0"/>
+        <w:jc w:val="both"/>
+        <w:rPr>
+          <w:lang w:val="en-US"/>
+        </w:rPr>
+      </w:pPr>
+    </w:p>
+    <w:p>
+      <w:pPr>
+        <w:spacing w:after="0"/>
+        <w:jc w:val="both"/>
+        <w:rPr>
+          <w:lang w:val="en-US"/>
+        </w:rPr>
       </w:pPr>
     </w:p>
     <w:sectPr>
@@ -6990,6 +7089,29 @@
       </w:tblBorders>
     </w:tblPr>
   </w:style>
+  <w:style w:type="character" w:styleId="Hyperlink">
+    <w:name w:val="Hyperlink"/>
+    <w:basedOn w:val="DefaultParagraphFont"/>
+    <w:uiPriority w:val="99"/>
+    <w:unhideWhenUsed/>
+    <w:rsid w:val="00C60B2B"/>
+    <w:rPr>
+      <w:color w:val="0563C1" w:themeColor="hyperlink"/>
+      <w:u w:val="single"/>
+    </w:rPr>
+  </w:style>
+  <w:style w:type="character" w:styleId="UnresolvedMention">
+    <w:name w:val="Unresolved Mention"/>
+    <w:basedOn w:val="DefaultParagraphFont"/>
+    <w:uiPriority w:val="99"/>
+    <w:semiHidden/>
+    <w:unhideWhenUsed/>
+    <w:rsid w:val="00C60B2B"/>
+    <w:rPr>
+      <w:color w:val="605E5C"/>
+      <w:shd w:val="clear" w:color="auto" w:fill="E1DFDD"/>
+    </w:rPr>
+  </w:style>
 </w:styles>
 </file>
 

</xml_diff>